<commit_message>
Agregada cabecera y nombres de columnas en cada pagina del template de word
</commit_message>
<xml_diff>
--- a/back/utils/templates/templateDocsV2.docx
+++ b/back/utils/templates/templateDocsV2.docx
@@ -14,242 +14,6 @@
           <w:bCs/>
           <w:sz w:val="48"/>
           <w:szCs w:val="48"/>
-        </w:rPr>
-      </w:pPr>
-      <w:bookmarkStart w:id="0" w:name="_GoBack"/>
-      <w:bookmarkEnd w:id="0"/>
-      <w:r>
-        <w:rPr>
-          <w:rFonts w:ascii="Times New Roman" w:hAnsi="Times New Roman"/>
-          <w:b/>
-          <w:bCs/>
-          <w:sz w:val="48"/>
-          <w:szCs w:val="48"/>
-          <w:lang w:val="es-AR"/>
-        </w:rPr>
-        <w:t>MINISTERIO DE EDUCACIÓN</w:t>
-      </w:r>
-    </w:p>
-    <w:p>
-      <w:pPr>
-        <w:pStyle w:val="Normal"/>
-        <w:bidi w:val="0"/>
-        <w:spacing w:lineRule="auto" w:line="240" w:before="0" w:after="0"/>
-        <w:jc w:val="center"/>
-        <w:rPr>
-          <w:rFonts w:ascii="Times New Roman" w:hAnsi="Times New Roman"/>
-          <w:b/>
-          <w:bCs/>
-          <w:sz w:val="32"/>
-          <w:szCs w:val="32"/>
-        </w:rPr>
-      </w:pPr>
-      <w:r>
-        <w:rPr>
-          <w:rFonts w:ascii="Times New Roman" w:hAnsi="Times New Roman"/>
-          <w:b/>
-          <w:bCs/>
-          <w:sz w:val="32"/>
-          <w:szCs w:val="32"/>
-          <w:lang w:val="es-AR"/>
-        </w:rPr>
-        <w:t>Secretaría Administrativa Financiera</w:t>
-      </w:r>
-    </w:p>
-    <w:p>
-      <w:pPr>
-        <w:pStyle w:val="Normal"/>
-        <w:bidi w:val="0"/>
-        <w:spacing w:lineRule="auto" w:line="240" w:before="0" w:after="0"/>
-        <w:jc w:val="center"/>
-        <w:rPr>
-          <w:rFonts w:ascii="Times New Roman" w:hAnsi="Times New Roman"/>
-          <w:lang w:val="es-AR"/>
-        </w:rPr>
-      </w:pPr>
-      <w:r>
-        <w:rPr>
-          <w:rFonts w:ascii="Times New Roman" w:hAnsi="Times New Roman"/>
-          <w:lang w:val="es-AR"/>
-        </w:rPr>
-      </w:r>
-    </w:p>
-    <w:p>
-      <w:pPr>
-        <w:pStyle w:val="Normal"/>
-        <w:bidi w:val="0"/>
-        <w:spacing w:lineRule="auto" w:line="240" w:before="0" w:after="0"/>
-        <w:jc w:val="center"/>
-        <w:rPr>
-          <w:rFonts w:ascii="Times New Roman" w:hAnsi="Times New Roman"/>
-          <w:sz w:val="32"/>
-          <w:szCs w:val="32"/>
-        </w:rPr>
-      </w:pPr>
-      <w:r>
-        <w:rPr>
-          <w:rFonts w:ascii="Times New Roman" w:hAnsi="Times New Roman"/>
-          <w:sz w:val="32"/>
-          <w:szCs w:val="32"/>
-          <w:lang w:val="es-AR"/>
-        </w:rPr>
-        <w:t>BAJA DE ACREDITACIONES BANCARIAS</w:t>
-      </w:r>
-    </w:p>
-    <w:tbl>
-      <w:tblPr>
-        <w:tblW w:w="5000" w:type="pct"/>
-        <w:jc w:val="start"/>
-        <w:tblInd w:w="-5" w:type="dxa"/>
-        <w:tblLayout w:type="fixed"/>
-        <w:tblCellMar>
-          <w:top w:w="55" w:type="dxa"/>
-          <w:start w:w="55" w:type="dxa"/>
-          <w:bottom w:w="55" w:type="dxa"/>
-          <w:end w:w="55" w:type="dxa"/>
-        </w:tblCellMar>
-      </w:tblPr>
-      <w:tblGrid>
-        <w:gridCol w:w="4856"/>
-        <w:gridCol w:w="4857"/>
-        <w:gridCol w:w="4857"/>
-      </w:tblGrid>
-      <w:tr>
-        <w:trPr>
-          <w:trHeight w:val="540" w:hRule="atLeast"/>
-        </w:trPr>
-        <w:tc>
-          <w:tcPr>
-            <w:tcW w:w="4856" w:type="dxa"/>
-            <w:tcBorders>
-              <w:top w:val="single" w:sz="4" w:space="0" w:color="000000"/>
-              <w:start w:val="single" w:sz="4" w:space="0" w:color="000000"/>
-              <w:bottom w:val="single" w:sz="4" w:space="0" w:color="000000"/>
-            </w:tcBorders>
-          </w:tcPr>
-          <w:p>
-            <w:pPr>
-              <w:pStyle w:val="Normal"/>
-              <w:bidi w:val="0"/>
-              <w:spacing w:lineRule="auto" w:line="240" w:before="0" w:after="0"/>
-              <w:jc w:val="start"/>
-              <w:rPr>
-                <w:sz w:val="20"/>
-                <w:szCs w:val="20"/>
-              </w:rPr>
-            </w:pPr>
-            <w:r>
-              <w:rPr>
-                <w:rFonts w:ascii="Times New Roman" w:hAnsi="Times New Roman"/>
-                <w:b/>
-                <w:bCs/>
-                <w:sz w:val="20"/>
-                <w:szCs w:val="20"/>
-                <w:lang w:val="es-AR"/>
-              </w:rPr>
-              <w:t>Concepto</w:t>
-            </w:r>
-            <w:r>
-              <w:rPr>
-                <w:rFonts w:ascii="Times New Roman" w:hAnsi="Times New Roman"/>
-                <w:sz w:val="20"/>
-                <w:szCs w:val="20"/>
-                <w:lang w:val="es-AR"/>
-              </w:rPr>
-              <w:t xml:space="preserve"> {{ concepto }}</w:t>
-            </w:r>
-          </w:p>
-        </w:tc>
-        <w:tc>
-          <w:tcPr>
-            <w:tcW w:w="4857" w:type="dxa"/>
-            <w:tcBorders>
-              <w:top w:val="single" w:sz="4" w:space="0" w:color="000000"/>
-              <w:bottom w:val="single" w:sz="4" w:space="0" w:color="000000"/>
-            </w:tcBorders>
-          </w:tcPr>
-          <w:p>
-            <w:pPr>
-              <w:pStyle w:val="Normal"/>
-              <w:bidi w:val="0"/>
-              <w:spacing w:lineRule="auto" w:line="240" w:before="0" w:after="0"/>
-              <w:jc w:val="start"/>
-              <w:rPr>
-                <w:sz w:val="20"/>
-                <w:szCs w:val="20"/>
-              </w:rPr>
-            </w:pPr>
-            <w:r>
-              <w:rPr>
-                <w:b/>
-                <w:bCs/>
-                <w:sz w:val="20"/>
-                <w:szCs w:val="20"/>
-                <w:lang w:val="es-AR"/>
-              </w:rPr>
-              <w:t>Disco</w:t>
-            </w:r>
-            <w:r>
-              <w:rPr>
-                <w:sz w:val="20"/>
-                <w:szCs w:val="20"/>
-                <w:lang w:val="es-AR"/>
-              </w:rPr>
-              <w:t xml:space="preserve"> {{ concepto }}</w:t>
-            </w:r>
-          </w:p>
-        </w:tc>
-        <w:tc>
-          <w:tcPr>
-            <w:tcW w:w="4857" w:type="dxa"/>
-            <w:tcBorders>
-              <w:top w:val="single" w:sz="4" w:space="0" w:color="000000"/>
-              <w:bottom w:val="single" w:sz="4" w:space="0" w:color="000000"/>
-              <w:end w:val="single" w:sz="4" w:space="0" w:color="000000"/>
-            </w:tcBorders>
-          </w:tcPr>
-          <w:p>
-            <w:pPr>
-              <w:pStyle w:val="Normal"/>
-              <w:bidi w:val="0"/>
-              <w:spacing w:lineRule="auto" w:line="240" w:before="0" w:after="0"/>
-              <w:jc w:val="start"/>
-              <w:rPr>
-                <w:sz w:val="20"/>
-                <w:szCs w:val="20"/>
-              </w:rPr>
-            </w:pPr>
-            <w:r>
-              <w:rPr>
-                <w:b/>
-                <w:bCs/>
-                <w:sz w:val="20"/>
-                <w:szCs w:val="20"/>
-                <w:lang w:val="es-AR"/>
-              </w:rPr>
-              <w:t>Fecha de Pago</w:t>
-            </w:r>
-            <w:r>
-              <w:rPr>
-                <w:sz w:val="20"/>
-                <w:szCs w:val="20"/>
-                <w:lang w:val="es-AR"/>
-              </w:rPr>
-              <w:t xml:space="preserve"> 30/06/2026</w:t>
-            </w:r>
-          </w:p>
-        </w:tc>
-      </w:tr>
-    </w:tbl>
-    <w:p>
-      <w:pPr>
-        <w:pStyle w:val="Normal"/>
-        <w:bidi w:val="0"/>
-        <w:spacing w:lineRule="auto" w:line="240" w:before="0" w:after="0"/>
-        <w:jc w:val="start"/>
-        <w:rPr>
-          <w:rFonts w:ascii="Times New Roman" w:hAnsi="Times New Roman"/>
-          <w:lang w:val="es-AR"/>
         </w:rPr>
       </w:pPr>
       <w:r>
@@ -278,14 +42,15 @@
         <w:gridCol w:w="1537"/>
         <w:gridCol w:w="1345"/>
         <w:gridCol w:w="1257"/>
-        <w:gridCol w:w="579"/>
+        <w:gridCol w:w="578"/>
         <w:gridCol w:w="720"/>
-        <w:gridCol w:w="720"/>
-        <w:gridCol w:w="1440"/>
-        <w:gridCol w:w="3228"/>
+        <w:gridCol w:w="721"/>
+        <w:gridCol w:w="1439"/>
+        <w:gridCol w:w="3229"/>
       </w:tblGrid>
       <w:tr>
         <w:trPr>
+          <w:tblHeader w:val="true"/>
           <w:trHeight w:val="562" w:hRule="exact"/>
         </w:trPr>
         <w:tc>
@@ -445,7 +210,7 @@
         </w:tc>
         <w:tc>
           <w:tcPr>
-            <w:tcW w:w="579" w:type="dxa"/>
+            <w:tcW w:w="578" w:type="dxa"/>
             <w:tcBorders>
               <w:top w:val="single" w:sz="4" w:space="0" w:color="000000"/>
               <w:start w:val="single" w:sz="4" w:space="0" w:color="000000"/>
@@ -507,7 +272,7 @@
         </w:tc>
         <w:tc>
           <w:tcPr>
-            <w:tcW w:w="720" w:type="dxa"/>
+            <w:tcW w:w="721" w:type="dxa"/>
             <w:tcBorders>
               <w:top w:val="single" w:sz="4" w:space="0" w:color="000000"/>
               <w:start w:val="single" w:sz="4" w:space="0" w:color="000000"/>
@@ -538,7 +303,7 @@
         </w:tc>
         <w:tc>
           <w:tcPr>
-            <w:tcW w:w="1440" w:type="dxa"/>
+            <w:tcW w:w="1439" w:type="dxa"/>
             <w:tcBorders>
               <w:top w:val="single" w:sz="4" w:space="0" w:color="000000"/>
               <w:start w:val="single" w:sz="4" w:space="0" w:color="000000"/>
@@ -569,7 +334,7 @@
         </w:tc>
         <w:tc>
           <w:tcPr>
-            <w:tcW w:w="3228" w:type="dxa"/>
+            <w:tcW w:w="3229" w:type="dxa"/>
             <w:tcBorders>
               <w:top w:val="single" w:sz="4" w:space="0" w:color="000000"/>
               <w:start w:val="single" w:sz="4" w:space="0" w:color="000000"/>
@@ -746,7 +511,7 @@
         </w:tc>
         <w:tc>
           <w:tcPr>
-            <w:tcW w:w="579" w:type="dxa"/>
+            <w:tcW w:w="578" w:type="dxa"/>
             <w:tcBorders>
               <w:start w:val="single" w:sz="4" w:space="0" w:color="000000"/>
               <w:bottom w:val="single" w:sz="4" w:space="0" w:color="000000"/>
@@ -802,63 +567,63 @@
         </w:tc>
         <w:tc>
           <w:tcPr>
-            <w:tcW w:w="720" w:type="dxa"/>
-            <w:tcBorders>
-              <w:start w:val="single" w:sz="4" w:space="0" w:color="000000"/>
-              <w:bottom w:val="single" w:sz="4" w:space="0" w:color="000000"/>
-            </w:tcBorders>
-          </w:tcPr>
-          <w:p>
-            <w:pPr>
-              <w:pStyle w:val="TableContents"/>
-              <w:bidi w:val="0"/>
-              <w:jc w:val="start"/>
-              <w:rPr>
-                <w:rFonts w:ascii="Times New Roman" w:hAnsi="Times New Roman"/>
-                <w:sz w:val="20"/>
-                <w:szCs w:val="20"/>
-              </w:rPr>
-            </w:pPr>
-            <w:r>
-              <w:rPr>
-                <w:rFonts w:ascii="Times New Roman" w:hAnsi="Times New Roman"/>
-                <w:sz w:val="20"/>
-                <w:szCs w:val="20"/>
-              </w:rPr>
-            </w:r>
-          </w:p>
-        </w:tc>
-        <w:tc>
-          <w:tcPr>
-            <w:tcW w:w="1440" w:type="dxa"/>
-            <w:tcBorders>
-              <w:start w:val="single" w:sz="4" w:space="0" w:color="000000"/>
-              <w:bottom w:val="single" w:sz="4" w:space="0" w:color="000000"/>
-            </w:tcBorders>
-          </w:tcPr>
-          <w:p>
-            <w:pPr>
-              <w:pStyle w:val="TableContents"/>
-              <w:bidi w:val="0"/>
-              <w:jc w:val="start"/>
-              <w:rPr>
-                <w:rFonts w:ascii="Times New Roman" w:hAnsi="Times New Roman"/>
-                <w:sz w:val="20"/>
-                <w:szCs w:val="20"/>
-              </w:rPr>
-            </w:pPr>
-            <w:r>
-              <w:rPr>
-                <w:rFonts w:ascii="Times New Roman" w:hAnsi="Times New Roman"/>
-                <w:sz w:val="20"/>
-                <w:szCs w:val="20"/>
-              </w:rPr>
-            </w:r>
-          </w:p>
-        </w:tc>
-        <w:tc>
-          <w:tcPr>
-            <w:tcW w:w="3228" w:type="dxa"/>
+            <w:tcW w:w="721" w:type="dxa"/>
+            <w:tcBorders>
+              <w:start w:val="single" w:sz="4" w:space="0" w:color="000000"/>
+              <w:bottom w:val="single" w:sz="4" w:space="0" w:color="000000"/>
+            </w:tcBorders>
+          </w:tcPr>
+          <w:p>
+            <w:pPr>
+              <w:pStyle w:val="TableContents"/>
+              <w:bidi w:val="0"/>
+              <w:jc w:val="start"/>
+              <w:rPr>
+                <w:rFonts w:ascii="Times New Roman" w:hAnsi="Times New Roman"/>
+                <w:sz w:val="20"/>
+                <w:szCs w:val="20"/>
+              </w:rPr>
+            </w:pPr>
+            <w:r>
+              <w:rPr>
+                <w:rFonts w:ascii="Times New Roman" w:hAnsi="Times New Roman"/>
+                <w:sz w:val="20"/>
+                <w:szCs w:val="20"/>
+              </w:rPr>
+            </w:r>
+          </w:p>
+        </w:tc>
+        <w:tc>
+          <w:tcPr>
+            <w:tcW w:w="1439" w:type="dxa"/>
+            <w:tcBorders>
+              <w:start w:val="single" w:sz="4" w:space="0" w:color="000000"/>
+              <w:bottom w:val="single" w:sz="4" w:space="0" w:color="000000"/>
+            </w:tcBorders>
+          </w:tcPr>
+          <w:p>
+            <w:pPr>
+              <w:pStyle w:val="TableContents"/>
+              <w:bidi w:val="0"/>
+              <w:jc w:val="start"/>
+              <w:rPr>
+                <w:rFonts w:ascii="Times New Roman" w:hAnsi="Times New Roman"/>
+                <w:sz w:val="20"/>
+                <w:szCs w:val="20"/>
+              </w:rPr>
+            </w:pPr>
+            <w:r>
+              <w:rPr>
+                <w:rFonts w:ascii="Times New Roman" w:hAnsi="Times New Roman"/>
+                <w:sz w:val="20"/>
+                <w:szCs w:val="20"/>
+              </w:rPr>
+            </w:r>
+          </w:p>
+        </w:tc>
+        <w:tc>
+          <w:tcPr>
+            <w:tcW w:w="3229" w:type="dxa"/>
             <w:tcBorders>
               <w:start w:val="single" w:sz="4" w:space="0" w:color="000000"/>
               <w:bottom w:val="single" w:sz="4" w:space="0" w:color="000000"/>
@@ -1033,7 +798,7 @@
         </w:tc>
         <w:tc>
           <w:tcPr>
-            <w:tcW w:w="579" w:type="dxa"/>
+            <w:tcW w:w="578" w:type="dxa"/>
             <w:tcBorders>
               <w:start w:val="single" w:sz="4" w:space="0" w:color="000000"/>
               <w:bottom w:val="single" w:sz="4" w:space="0" w:color="000000"/>
@@ -1089,7 +854,7 @@
         </w:tc>
         <w:tc>
           <w:tcPr>
-            <w:tcW w:w="720" w:type="dxa"/>
+            <w:tcW w:w="721" w:type="dxa"/>
             <w:tcBorders>
               <w:start w:val="single" w:sz="4" w:space="0" w:color="000000"/>
               <w:bottom w:val="single" w:sz="4" w:space="0" w:color="000000"/>
@@ -1117,7 +882,7 @@
         </w:tc>
         <w:tc>
           <w:tcPr>
-            <w:tcW w:w="1440" w:type="dxa"/>
+            <w:tcW w:w="1439" w:type="dxa"/>
             <w:tcBorders>
               <w:start w:val="single" w:sz="4" w:space="0" w:color="000000"/>
               <w:bottom w:val="single" w:sz="4" w:space="0" w:color="000000"/>
@@ -1145,7 +910,7 @@
         </w:tc>
         <w:tc>
           <w:tcPr>
-            <w:tcW w:w="3228" w:type="dxa"/>
+            <w:tcW w:w="3229" w:type="dxa"/>
             <w:tcBorders>
               <w:start w:val="single" w:sz="4" w:space="0" w:color="000000"/>
               <w:bottom w:val="single" w:sz="4" w:space="0" w:color="000000"/>
@@ -1322,7 +1087,7 @@
         </w:tc>
         <w:tc>
           <w:tcPr>
-            <w:tcW w:w="579" w:type="dxa"/>
+            <w:tcW w:w="578" w:type="dxa"/>
             <w:tcBorders>
               <w:start w:val="single" w:sz="4" w:space="0" w:color="000000"/>
               <w:bottom w:val="single" w:sz="4" w:space="0" w:color="000000"/>
@@ -1378,63 +1143,63 @@
         </w:tc>
         <w:tc>
           <w:tcPr>
-            <w:tcW w:w="720" w:type="dxa"/>
-            <w:tcBorders>
-              <w:start w:val="single" w:sz="4" w:space="0" w:color="000000"/>
-              <w:bottom w:val="single" w:sz="4" w:space="0" w:color="000000"/>
-            </w:tcBorders>
-          </w:tcPr>
-          <w:p>
-            <w:pPr>
-              <w:pStyle w:val="TableContents"/>
-              <w:bidi w:val="0"/>
-              <w:jc w:val="start"/>
-              <w:rPr>
-                <w:rFonts w:ascii="Times New Roman" w:hAnsi="Times New Roman"/>
-                <w:sz w:val="20"/>
-                <w:szCs w:val="20"/>
-              </w:rPr>
-            </w:pPr>
-            <w:r>
-              <w:rPr>
-                <w:rFonts w:ascii="Times New Roman" w:hAnsi="Times New Roman"/>
-                <w:sz w:val="20"/>
-                <w:szCs w:val="20"/>
-              </w:rPr>
-            </w:r>
-          </w:p>
-        </w:tc>
-        <w:tc>
-          <w:tcPr>
-            <w:tcW w:w="1440" w:type="dxa"/>
-            <w:tcBorders>
-              <w:start w:val="single" w:sz="4" w:space="0" w:color="000000"/>
-              <w:bottom w:val="single" w:sz="4" w:space="0" w:color="000000"/>
-            </w:tcBorders>
-          </w:tcPr>
-          <w:p>
-            <w:pPr>
-              <w:pStyle w:val="TableContents"/>
-              <w:bidi w:val="0"/>
-              <w:jc w:val="start"/>
-              <w:rPr>
-                <w:rFonts w:ascii="Times New Roman" w:hAnsi="Times New Roman"/>
-                <w:sz w:val="20"/>
-                <w:szCs w:val="20"/>
-              </w:rPr>
-            </w:pPr>
-            <w:r>
-              <w:rPr>
-                <w:rFonts w:ascii="Times New Roman" w:hAnsi="Times New Roman"/>
-                <w:sz w:val="20"/>
-                <w:szCs w:val="20"/>
-              </w:rPr>
-            </w:r>
-          </w:p>
-        </w:tc>
-        <w:tc>
-          <w:tcPr>
-            <w:tcW w:w="3228" w:type="dxa"/>
+            <w:tcW w:w="721" w:type="dxa"/>
+            <w:tcBorders>
+              <w:start w:val="single" w:sz="4" w:space="0" w:color="000000"/>
+              <w:bottom w:val="single" w:sz="4" w:space="0" w:color="000000"/>
+            </w:tcBorders>
+          </w:tcPr>
+          <w:p>
+            <w:pPr>
+              <w:pStyle w:val="TableContents"/>
+              <w:bidi w:val="0"/>
+              <w:jc w:val="start"/>
+              <w:rPr>
+                <w:rFonts w:ascii="Times New Roman" w:hAnsi="Times New Roman"/>
+                <w:sz w:val="20"/>
+                <w:szCs w:val="20"/>
+              </w:rPr>
+            </w:pPr>
+            <w:r>
+              <w:rPr>
+                <w:rFonts w:ascii="Times New Roman" w:hAnsi="Times New Roman"/>
+                <w:sz w:val="20"/>
+                <w:szCs w:val="20"/>
+              </w:rPr>
+            </w:r>
+          </w:p>
+        </w:tc>
+        <w:tc>
+          <w:tcPr>
+            <w:tcW w:w="1439" w:type="dxa"/>
+            <w:tcBorders>
+              <w:start w:val="single" w:sz="4" w:space="0" w:color="000000"/>
+              <w:bottom w:val="single" w:sz="4" w:space="0" w:color="000000"/>
+            </w:tcBorders>
+          </w:tcPr>
+          <w:p>
+            <w:pPr>
+              <w:pStyle w:val="TableContents"/>
+              <w:bidi w:val="0"/>
+              <w:jc w:val="start"/>
+              <w:rPr>
+                <w:rFonts w:ascii="Times New Roman" w:hAnsi="Times New Roman"/>
+                <w:sz w:val="20"/>
+                <w:szCs w:val="20"/>
+              </w:rPr>
+            </w:pPr>
+            <w:r>
+              <w:rPr>
+                <w:rFonts w:ascii="Times New Roman" w:hAnsi="Times New Roman"/>
+                <w:sz w:val="20"/>
+                <w:szCs w:val="20"/>
+              </w:rPr>
+            </w:r>
+          </w:p>
+        </w:tc>
+        <w:tc>
+          <w:tcPr>
+            <w:tcW w:w="3229" w:type="dxa"/>
             <w:tcBorders>
               <w:start w:val="single" w:sz="4" w:space="0" w:color="000000"/>
               <w:bottom w:val="single" w:sz="4" w:space="0" w:color="000000"/>
@@ -1589,9 +1354,10 @@
       </w:r>
     </w:p>
     <w:sectPr>
+      <w:headerReference w:type="default" r:id="rId2"/>
       <w:type w:val="nextPage"/>
       <w:pgSz w:orient="landscape" w:w="16838" w:h="11906"/>
-      <w:pgMar w:left="1134" w:right="1134" w:gutter="0" w:header="0" w:top="562" w:footer="0" w:bottom="1134"/>
+      <w:pgMar w:left="1134" w:right="1134" w:gutter="0" w:header="562" w:top="3355" w:footer="0" w:bottom="1134"/>
       <w:pgNumType w:fmt="decimal"/>
       <w:formProt w:val="false"/>
       <w:textDirection w:val="lrTb"/>
@@ -1599,6 +1365,268 @@
     </w:sectPr>
   </w:body>
 </w:document>
+</file>
+
+<file path=word/header1.xml><?xml version="1.0" encoding="utf-8"?>
+<w:hdr xmlns:o="urn:schemas-microsoft-com:office:office" xmlns:r="http://schemas.openxmlformats.org/officeDocument/2006/relationships" xmlns:v="urn:schemas-microsoft-com:vml" xmlns:w="http://schemas.openxmlformats.org/wordprocessingml/2006/main" xmlns:w10="urn:schemas-microsoft-com:office:word" xmlns:wp="http://schemas.openxmlformats.org/drawingml/2006/wordprocessingDrawing" xmlns:pic="http://schemas.openxmlformats.org/drawingml/2006/picture" xmlns:wps="http://schemas.microsoft.com/office/word/2010/wordprocessingShape" xmlns:wpg="http://schemas.microsoft.com/office/word/2010/wordprocessingGroup" xmlns:mc="http://schemas.openxmlformats.org/markup-compatibility/2006" xmlns:wp14="http://schemas.microsoft.com/office/word/2010/wordprocessingDrawing" xmlns:w14="http://schemas.microsoft.com/office/word/2010/wordml" xmlns:w15="http://schemas.microsoft.com/office/word/2012/wordml" mc:Ignorable="w14 wp14 w15">
+  <w:p>
+    <w:pPr>
+      <w:pStyle w:val="Normal"/>
+      <w:bidi w:val="0"/>
+      <w:spacing w:lineRule="auto" w:line="240" w:before="0" w:after="0"/>
+      <w:jc w:val="center"/>
+      <w:rPr>
+        <w:rFonts w:ascii="Times New Roman" w:hAnsi="Times New Roman"/>
+        <w:b/>
+        <w:bCs/>
+        <w:sz w:val="48"/>
+        <w:szCs w:val="48"/>
+      </w:rPr>
+    </w:pPr>
+    <w:bookmarkStart w:id="0" w:name="_GoBack"/>
+    <w:bookmarkEnd w:id="0"/>
+    <w:r>
+      <w:rPr>
+        <w:rFonts w:ascii="Times New Roman" w:hAnsi="Times New Roman"/>
+        <w:b/>
+        <w:bCs/>
+        <w:sz w:val="48"/>
+        <w:szCs w:val="48"/>
+        <w:lang w:val="es-AR"/>
+      </w:rPr>
+      <w:t>MINISTERIO DE EDUCACIÓN</w:t>
+    </w:r>
+  </w:p>
+  <w:p>
+    <w:pPr>
+      <w:pStyle w:val="Normal"/>
+      <w:bidi w:val="0"/>
+      <w:spacing w:lineRule="auto" w:line="240" w:before="0" w:after="0"/>
+      <w:jc w:val="center"/>
+      <w:rPr>
+        <w:rFonts w:ascii="Times New Roman" w:hAnsi="Times New Roman"/>
+        <w:b/>
+        <w:bCs/>
+        <w:sz w:val="32"/>
+        <w:szCs w:val="32"/>
+      </w:rPr>
+    </w:pPr>
+    <w:r>
+      <w:rPr>
+        <w:rFonts w:ascii="Times New Roman" w:hAnsi="Times New Roman"/>
+        <w:b/>
+        <w:bCs/>
+        <w:sz w:val="32"/>
+        <w:szCs w:val="32"/>
+        <w:lang w:val="es-AR"/>
+      </w:rPr>
+      <w:t>Secretaría Administrativa Financiera</w:t>
+    </w:r>
+  </w:p>
+  <w:p>
+    <w:pPr>
+      <w:pStyle w:val="Normal"/>
+      <w:bidi w:val="0"/>
+      <w:spacing w:lineRule="auto" w:line="240" w:before="0" w:after="0"/>
+      <w:jc w:val="center"/>
+      <w:rPr>
+        <w:rFonts w:ascii="Times New Roman" w:hAnsi="Times New Roman"/>
+        <w:lang w:val="es-AR"/>
+      </w:rPr>
+    </w:pPr>
+    <w:r>
+      <w:rPr>
+        <w:rFonts w:ascii="Times New Roman" w:hAnsi="Times New Roman"/>
+        <w:lang w:val="es-AR"/>
+      </w:rPr>
+    </w:r>
+  </w:p>
+  <w:p>
+    <w:pPr>
+      <w:pStyle w:val="Normal"/>
+      <w:bidi w:val="0"/>
+      <w:spacing w:lineRule="auto" w:line="240" w:before="0" w:after="0"/>
+      <w:jc w:val="center"/>
+      <w:rPr>
+        <w:rFonts w:ascii="Times New Roman" w:hAnsi="Times New Roman"/>
+        <w:sz w:val="32"/>
+        <w:szCs w:val="32"/>
+      </w:rPr>
+    </w:pPr>
+    <w:r>
+      <w:rPr>
+        <w:rFonts w:ascii="Times New Roman" w:hAnsi="Times New Roman"/>
+        <w:sz w:val="32"/>
+        <w:szCs w:val="32"/>
+        <w:lang w:val="es-AR"/>
+      </w:rPr>
+      <w:t>BAJA DE ACREDITACIONES BANCARIAS</w:t>
+    </w:r>
+  </w:p>
+  <w:tbl>
+    <w:tblPr>
+      <w:tblW w:w="5000" w:type="pct"/>
+      <w:jc w:val="start"/>
+      <w:tblInd w:w="-5" w:type="dxa"/>
+      <w:tblLayout w:type="fixed"/>
+      <w:tblCellMar>
+        <w:top w:w="55" w:type="dxa"/>
+        <w:start w:w="55" w:type="dxa"/>
+        <w:bottom w:w="55" w:type="dxa"/>
+        <w:end w:w="55" w:type="dxa"/>
+      </w:tblCellMar>
+    </w:tblPr>
+    <w:tblGrid>
+      <w:gridCol w:w="4856"/>
+      <w:gridCol w:w="4857"/>
+      <w:gridCol w:w="4857"/>
+    </w:tblGrid>
+    <w:tr>
+      <w:trPr>
+        <w:trHeight w:val="540" w:hRule="atLeast"/>
+      </w:trPr>
+      <w:tc>
+        <w:tcPr>
+          <w:tcW w:w="4856" w:type="dxa"/>
+          <w:tcBorders>
+            <w:top w:val="single" w:sz="4" w:space="0" w:color="000000"/>
+            <w:start w:val="single" w:sz="4" w:space="0" w:color="000000"/>
+            <w:bottom w:val="single" w:sz="4" w:space="0" w:color="000000"/>
+          </w:tcBorders>
+        </w:tcPr>
+        <w:p>
+          <w:pPr>
+            <w:pStyle w:val="Normal"/>
+            <w:bidi w:val="0"/>
+            <w:spacing w:lineRule="auto" w:line="240" w:before="0" w:after="0"/>
+            <w:jc w:val="start"/>
+            <w:rPr>
+              <w:sz w:val="20"/>
+              <w:szCs w:val="20"/>
+            </w:rPr>
+          </w:pPr>
+          <w:r>
+            <w:rPr>
+              <w:rFonts w:ascii="Times New Roman" w:hAnsi="Times New Roman"/>
+              <w:b/>
+              <w:bCs/>
+              <w:sz w:val="20"/>
+              <w:szCs w:val="20"/>
+              <w:lang w:val="es-AR"/>
+            </w:rPr>
+            <w:t>Concepto</w:t>
+          </w:r>
+          <w:r>
+            <w:rPr>
+              <w:rFonts w:ascii="Times New Roman" w:hAnsi="Times New Roman"/>
+              <w:sz w:val="20"/>
+              <w:szCs w:val="20"/>
+              <w:lang w:val="es-AR"/>
+            </w:rPr>
+            <w:t xml:space="preserve"> {{ concepto }}</w:t>
+          </w:r>
+        </w:p>
+      </w:tc>
+      <w:tc>
+        <w:tcPr>
+          <w:tcW w:w="4857" w:type="dxa"/>
+          <w:tcBorders>
+            <w:top w:val="single" w:sz="4" w:space="0" w:color="000000"/>
+            <w:bottom w:val="single" w:sz="4" w:space="0" w:color="000000"/>
+          </w:tcBorders>
+        </w:tcPr>
+        <w:p>
+          <w:pPr>
+            <w:pStyle w:val="Normal"/>
+            <w:bidi w:val="0"/>
+            <w:spacing w:lineRule="auto" w:line="240" w:before="0" w:after="0"/>
+            <w:jc w:val="start"/>
+            <w:rPr>
+              <w:sz w:val="20"/>
+              <w:szCs w:val="20"/>
+            </w:rPr>
+          </w:pPr>
+          <w:r>
+            <w:rPr>
+              <w:b/>
+              <w:bCs/>
+              <w:sz w:val="20"/>
+              <w:szCs w:val="20"/>
+              <w:lang w:val="es-AR"/>
+            </w:rPr>
+            <w:t>Disco</w:t>
+          </w:r>
+          <w:r>
+            <w:rPr>
+              <w:sz w:val="20"/>
+              <w:szCs w:val="20"/>
+              <w:lang w:val="es-AR"/>
+            </w:rPr>
+            <w:t xml:space="preserve"> {{ concepto }}</w:t>
+          </w:r>
+        </w:p>
+      </w:tc>
+      <w:tc>
+        <w:tcPr>
+          <w:tcW w:w="4857" w:type="dxa"/>
+          <w:tcBorders>
+            <w:top w:val="single" w:sz="4" w:space="0" w:color="000000"/>
+            <w:bottom w:val="single" w:sz="4" w:space="0" w:color="000000"/>
+            <w:end w:val="single" w:sz="4" w:space="0" w:color="000000"/>
+          </w:tcBorders>
+        </w:tcPr>
+        <w:p>
+          <w:pPr>
+            <w:pStyle w:val="Normal"/>
+            <w:bidi w:val="0"/>
+            <w:spacing w:lineRule="auto" w:line="240" w:before="0" w:after="0"/>
+            <w:jc w:val="start"/>
+            <w:rPr>
+              <w:sz w:val="20"/>
+              <w:szCs w:val="20"/>
+            </w:rPr>
+          </w:pPr>
+          <w:r>
+            <w:rPr>
+              <w:b/>
+              <w:bCs/>
+              <w:sz w:val="20"/>
+              <w:szCs w:val="20"/>
+              <w:lang w:val="es-AR"/>
+            </w:rPr>
+            <w:t>Fecha de Pago</w:t>
+          </w:r>
+          <w:r>
+            <w:rPr>
+              <w:sz w:val="20"/>
+              <w:szCs w:val="20"/>
+              <w:lang w:val="es-AR"/>
+            </w:rPr>
+            <w:t xml:space="preserve"> 30/06/2026</w:t>
+          </w:r>
+        </w:p>
+      </w:tc>
+    </w:tr>
+  </w:tbl>
+  <w:p>
+    <w:pPr>
+      <w:pStyle w:val="Normal"/>
+      <w:bidi w:val="0"/>
+      <w:spacing w:lineRule="auto" w:line="240" w:before="0" w:after="0"/>
+      <w:jc w:val="start"/>
+      <w:rPr>
+        <w:rFonts w:ascii="Times New Roman" w:hAnsi="Times New Roman"/>
+        <w:lang w:val="es-AR"/>
+      </w:rPr>
+    </w:pPr>
+    <w:r>
+      <w:rPr>
+        <w:rFonts w:ascii="Times New Roman" w:hAnsi="Times New Roman"/>
+        <w:lang w:val="es-AR"/>
+      </w:rPr>
+    </w:r>
+  </w:p>
+</w:hdr>
 </file>
 
 <file path=word/numbering.xml><?xml version="1.0" encoding="utf-8"?>

</xml_diff>

<commit_message>
Alineado importe hacia la derecha en template docx
</commit_message>
<xml_diff>
--- a/back/utils/templates/templateDocsV2.docx
+++ b/back/utils/templates/templateDocsV2.docx
@@ -19,7 +19,10 @@
       <w:r>
         <w:rPr>
           <w:rFonts w:ascii="Times New Roman" w:hAnsi="Times New Roman"/>
-          <w:lang w:val="es-AR"/>
+          <w:b/>
+          <w:bCs/>
+          <w:sz w:val="48"/>
+          <w:szCs w:val="48"/>
         </w:rPr>
       </w:r>
     </w:p>
@@ -45,8 +48,8 @@
         <w:gridCol w:w="578"/>
         <w:gridCol w:w="720"/>
         <w:gridCol w:w="721"/>
-        <w:gridCol w:w="1439"/>
-        <w:gridCol w:w="3229"/>
+        <w:gridCol w:w="1438"/>
+        <w:gridCol w:w="3230"/>
       </w:tblGrid>
       <w:tr>
         <w:trPr>
@@ -129,10 +132,7 @@
               <w:pStyle w:val="TableContents"/>
               <w:bidi w:val="0"/>
               <w:jc w:val="start"/>
-              <w:rPr>
-                <w:sz w:val="20"/>
-                <w:szCs w:val="20"/>
-              </w:rPr>
+              <w:rPr/>
             </w:pPr>
             <w:r>
               <w:rPr>
@@ -303,7 +303,7 @@
         </w:tc>
         <w:tc>
           <w:tcPr>
-            <w:tcW w:w="1439" w:type="dxa"/>
+            <w:tcW w:w="1438" w:type="dxa"/>
             <w:tcBorders>
               <w:top w:val="single" w:sz="4" w:space="0" w:color="000000"/>
               <w:start w:val="single" w:sz="4" w:space="0" w:color="000000"/>
@@ -334,7 +334,7 @@
         </w:tc>
         <w:tc>
           <w:tcPr>
-            <w:tcW w:w="3229" w:type="dxa"/>
+            <w:tcW w:w="3230" w:type="dxa"/>
             <w:tcBorders>
               <w:top w:val="single" w:sz="4" w:space="0" w:color="000000"/>
               <w:start w:val="single" w:sz="4" w:space="0" w:color="000000"/>
@@ -437,6 +437,34 @@
             <w:pPr>
               <w:pStyle w:val="TableContents"/>
               <w:bidi w:val="0"/>
+              <w:jc w:val="end"/>
+              <w:rPr>
+                <w:rFonts w:ascii="Times New Roman" w:hAnsi="Times New Roman"/>
+                <w:sz w:val="20"/>
+                <w:szCs w:val="20"/>
+              </w:rPr>
+            </w:pPr>
+            <w:r>
+              <w:rPr>
+                <w:rFonts w:ascii="Times New Roman" w:hAnsi="Times New Roman"/>
+                <w:sz w:val="20"/>
+                <w:szCs w:val="20"/>
+              </w:rPr>
+            </w:r>
+          </w:p>
+        </w:tc>
+        <w:tc>
+          <w:tcPr>
+            <w:tcW w:w="1345" w:type="dxa"/>
+            <w:tcBorders>
+              <w:start w:val="single" w:sz="4" w:space="0" w:color="000000"/>
+              <w:bottom w:val="single" w:sz="4" w:space="0" w:color="000000"/>
+            </w:tcBorders>
+          </w:tcPr>
+          <w:p>
+            <w:pPr>
+              <w:pStyle w:val="TableContents"/>
+              <w:bidi w:val="0"/>
               <w:jc w:val="start"/>
               <w:rPr>
                 <w:rFonts w:ascii="Times New Roman" w:hAnsi="Times New Roman"/>
@@ -455,7 +483,7 @@
         </w:tc>
         <w:tc>
           <w:tcPr>
-            <w:tcW w:w="1345" w:type="dxa"/>
+            <w:tcW w:w="1257" w:type="dxa"/>
             <w:tcBorders>
               <w:start w:val="single" w:sz="4" w:space="0" w:color="000000"/>
               <w:bottom w:val="single" w:sz="4" w:space="0" w:color="000000"/>
@@ -483,7 +511,7 @@
         </w:tc>
         <w:tc>
           <w:tcPr>
-            <w:tcW w:w="1257" w:type="dxa"/>
+            <w:tcW w:w="578" w:type="dxa"/>
             <w:tcBorders>
               <w:start w:val="single" w:sz="4" w:space="0" w:color="000000"/>
               <w:bottom w:val="single" w:sz="4" w:space="0" w:color="000000"/>
@@ -511,7 +539,7 @@
         </w:tc>
         <w:tc>
           <w:tcPr>
-            <w:tcW w:w="578" w:type="dxa"/>
+            <w:tcW w:w="720" w:type="dxa"/>
             <w:tcBorders>
               <w:start w:val="single" w:sz="4" w:space="0" w:color="000000"/>
               <w:bottom w:val="single" w:sz="4" w:space="0" w:color="000000"/>
@@ -539,7 +567,7 @@
         </w:tc>
         <w:tc>
           <w:tcPr>
-            <w:tcW w:w="720" w:type="dxa"/>
+            <w:tcW w:w="721" w:type="dxa"/>
             <w:tcBorders>
               <w:start w:val="single" w:sz="4" w:space="0" w:color="000000"/>
               <w:bottom w:val="single" w:sz="4" w:space="0" w:color="000000"/>
@@ -567,7 +595,7 @@
         </w:tc>
         <w:tc>
           <w:tcPr>
-            <w:tcW w:w="721" w:type="dxa"/>
+            <w:tcW w:w="1438" w:type="dxa"/>
             <w:tcBorders>
               <w:start w:val="single" w:sz="4" w:space="0" w:color="000000"/>
               <w:bottom w:val="single" w:sz="4" w:space="0" w:color="000000"/>
@@ -595,35 +623,7 @@
         </w:tc>
         <w:tc>
           <w:tcPr>
-            <w:tcW w:w="1439" w:type="dxa"/>
-            <w:tcBorders>
-              <w:start w:val="single" w:sz="4" w:space="0" w:color="000000"/>
-              <w:bottom w:val="single" w:sz="4" w:space="0" w:color="000000"/>
-            </w:tcBorders>
-          </w:tcPr>
-          <w:p>
-            <w:pPr>
-              <w:pStyle w:val="TableContents"/>
-              <w:bidi w:val="0"/>
-              <w:jc w:val="start"/>
-              <w:rPr>
-                <w:rFonts w:ascii="Times New Roman" w:hAnsi="Times New Roman"/>
-                <w:sz w:val="20"/>
-                <w:szCs w:val="20"/>
-              </w:rPr>
-            </w:pPr>
-            <w:r>
-              <w:rPr>
-                <w:rFonts w:ascii="Times New Roman" w:hAnsi="Times New Roman"/>
-                <w:sz w:val="20"/>
-                <w:szCs w:val="20"/>
-              </w:rPr>
-            </w:r>
-          </w:p>
-        </w:tc>
-        <w:tc>
-          <w:tcPr>
-            <w:tcW w:w="3229" w:type="dxa"/>
+            <w:tcW w:w="3230" w:type="dxa"/>
             <w:tcBorders>
               <w:start w:val="single" w:sz="4" w:space="0" w:color="000000"/>
               <w:bottom w:val="single" w:sz="4" w:space="0" w:color="000000"/>
@@ -724,6 +724,31 @@
             <w:pPr>
               <w:pStyle w:val="TableContents"/>
               <w:bidi w:val="0"/>
+              <w:jc w:val="end"/>
+              <w:rPr/>
+            </w:pPr>
+            <w:r>
+              <w:rPr>
+                <w:rFonts w:ascii="Times New Roman" w:hAnsi="Times New Roman"/>
+                <w:sz w:val="20"/>
+                <w:szCs w:val="20"/>
+              </w:rPr>
+              <w:t>{{item.importe}}</w:t>
+            </w:r>
+          </w:p>
+        </w:tc>
+        <w:tc>
+          <w:tcPr>
+            <w:tcW w:w="1345" w:type="dxa"/>
+            <w:tcBorders>
+              <w:start w:val="single" w:sz="4" w:space="0" w:color="000000"/>
+              <w:bottom w:val="single" w:sz="4" w:space="0" w:color="000000"/>
+            </w:tcBorders>
+          </w:tcPr>
+          <w:p>
+            <w:pPr>
+              <w:pStyle w:val="TableContents"/>
+              <w:bidi w:val="0"/>
               <w:jc w:val="start"/>
               <w:rPr>
                 <w:sz w:val="20"/>
@@ -736,13 +761,13 @@
                 <w:sz w:val="20"/>
                 <w:szCs w:val="20"/>
               </w:rPr>
-              <w:t>{{item.importe}}</w:t>
-            </w:r>
-          </w:p>
-        </w:tc>
-        <w:tc>
-          <w:tcPr>
-            <w:tcW w:w="1345" w:type="dxa"/>
+              <w:t>{{item.cuenta_debito}}</w:t>
+            </w:r>
+          </w:p>
+        </w:tc>
+        <w:tc>
+          <w:tcPr>
+            <w:tcW w:w="1257" w:type="dxa"/>
             <w:tcBorders>
               <w:start w:val="single" w:sz="4" w:space="0" w:color="000000"/>
               <w:bottom w:val="single" w:sz="4" w:space="0" w:color="000000"/>
@@ -764,13 +789,13 @@
                 <w:sz w:val="20"/>
                 <w:szCs w:val="20"/>
               </w:rPr>
-              <w:t>{{item.cuenta_debito}}</w:t>
-            </w:r>
-          </w:p>
-        </w:tc>
-        <w:tc>
-          <w:tcPr>
-            <w:tcW w:w="1257" w:type="dxa"/>
+              <w:t>{{item.cuenta_acreditacion}}</w:t>
+            </w:r>
+          </w:p>
+        </w:tc>
+        <w:tc>
+          <w:tcPr>
+            <w:tcW w:w="578" w:type="dxa"/>
             <w:tcBorders>
               <w:start w:val="single" w:sz="4" w:space="0" w:color="000000"/>
               <w:bottom w:val="single" w:sz="4" w:space="0" w:color="000000"/>
@@ -792,13 +817,13 @@
                 <w:sz w:val="20"/>
                 <w:szCs w:val="20"/>
               </w:rPr>
-              <w:t>{{item.cuenta_acreditacion}}</w:t>
-            </w:r>
-          </w:p>
-        </w:tc>
-        <w:tc>
-          <w:tcPr>
-            <w:tcW w:w="578" w:type="dxa"/>
+              <w:t>{{item.zona}}</w:t>
+            </w:r>
+          </w:p>
+        </w:tc>
+        <w:tc>
+          <w:tcPr>
+            <w:tcW w:w="720" w:type="dxa"/>
             <w:tcBorders>
               <w:start w:val="single" w:sz="4" w:space="0" w:color="000000"/>
               <w:bottom w:val="single" w:sz="4" w:space="0" w:color="000000"/>
@@ -820,13 +845,13 @@
                 <w:sz w:val="20"/>
                 <w:szCs w:val="20"/>
               </w:rPr>
-              <w:t>{{item.zona}}</w:t>
-            </w:r>
-          </w:p>
-        </w:tc>
-        <w:tc>
-          <w:tcPr>
-            <w:tcW w:w="720" w:type="dxa"/>
+              <w:t>{{item.centro}}</w:t>
+            </w:r>
+          </w:p>
+        </w:tc>
+        <w:tc>
+          <w:tcPr>
+            <w:tcW w:w="721" w:type="dxa"/>
             <w:tcBorders>
               <w:start w:val="single" w:sz="4" w:space="0" w:color="000000"/>
               <w:bottom w:val="single" w:sz="4" w:space="0" w:color="000000"/>
@@ -848,13 +873,13 @@
                 <w:sz w:val="20"/>
                 <w:szCs w:val="20"/>
               </w:rPr>
-              <w:t>{{item.centro}}</w:t>
-            </w:r>
-          </w:p>
-        </w:tc>
-        <w:tc>
-          <w:tcPr>
-            <w:tcW w:w="721" w:type="dxa"/>
+              <w:t>{{item.sector}}</w:t>
+            </w:r>
+          </w:p>
+        </w:tc>
+        <w:tc>
+          <w:tcPr>
+            <w:tcW w:w="1438" w:type="dxa"/>
             <w:tcBorders>
               <w:start w:val="single" w:sz="4" w:space="0" w:color="000000"/>
               <w:bottom w:val="single" w:sz="4" w:space="0" w:color="000000"/>
@@ -876,41 +901,13 @@
                 <w:sz w:val="20"/>
                 <w:szCs w:val="20"/>
               </w:rPr>
-              <w:t>{{item.sector}}</w:t>
-            </w:r>
-          </w:p>
-        </w:tc>
-        <w:tc>
-          <w:tcPr>
-            <w:tcW w:w="1439" w:type="dxa"/>
-            <w:tcBorders>
-              <w:start w:val="single" w:sz="4" w:space="0" w:color="000000"/>
-              <w:bottom w:val="single" w:sz="4" w:space="0" w:color="000000"/>
-            </w:tcBorders>
-          </w:tcPr>
-          <w:p>
-            <w:pPr>
-              <w:pStyle w:val="TableContents"/>
-              <w:bidi w:val="0"/>
-              <w:jc w:val="start"/>
-              <w:rPr>
-                <w:sz w:val="20"/>
-                <w:szCs w:val="20"/>
-              </w:rPr>
-            </w:pPr>
-            <w:r>
-              <w:rPr>
-                <w:rFonts w:ascii="Times New Roman" w:hAnsi="Times New Roman"/>
-                <w:sz w:val="20"/>
-                <w:szCs w:val="20"/>
-              </w:rPr>
               <w:t>{{item.cuil}}</w:t>
             </w:r>
           </w:p>
         </w:tc>
         <w:tc>
           <w:tcPr>
-            <w:tcW w:w="3229" w:type="dxa"/>
+            <w:tcW w:w="3230" w:type="dxa"/>
             <w:tcBorders>
               <w:start w:val="single" w:sz="4" w:space="0" w:color="000000"/>
               <w:bottom w:val="single" w:sz="4" w:space="0" w:color="000000"/>
@@ -1013,6 +1010,34 @@
             <w:pPr>
               <w:pStyle w:val="TableContents"/>
               <w:bidi w:val="0"/>
+              <w:jc w:val="end"/>
+              <w:rPr>
+                <w:rFonts w:ascii="Times New Roman" w:hAnsi="Times New Roman"/>
+                <w:sz w:val="20"/>
+                <w:szCs w:val="20"/>
+              </w:rPr>
+            </w:pPr>
+            <w:r>
+              <w:rPr>
+                <w:rFonts w:ascii="Times New Roman" w:hAnsi="Times New Roman"/>
+                <w:sz w:val="20"/>
+                <w:szCs w:val="20"/>
+              </w:rPr>
+            </w:r>
+          </w:p>
+        </w:tc>
+        <w:tc>
+          <w:tcPr>
+            <w:tcW w:w="1345" w:type="dxa"/>
+            <w:tcBorders>
+              <w:start w:val="single" w:sz="4" w:space="0" w:color="000000"/>
+              <w:bottom w:val="single" w:sz="4" w:space="0" w:color="000000"/>
+            </w:tcBorders>
+          </w:tcPr>
+          <w:p>
+            <w:pPr>
+              <w:pStyle w:val="TableContents"/>
+              <w:bidi w:val="0"/>
               <w:jc w:val="start"/>
               <w:rPr>
                 <w:rFonts w:ascii="Times New Roman" w:hAnsi="Times New Roman"/>
@@ -1031,7 +1056,7 @@
         </w:tc>
         <w:tc>
           <w:tcPr>
-            <w:tcW w:w="1345" w:type="dxa"/>
+            <w:tcW w:w="1257" w:type="dxa"/>
             <w:tcBorders>
               <w:start w:val="single" w:sz="4" w:space="0" w:color="000000"/>
               <w:bottom w:val="single" w:sz="4" w:space="0" w:color="000000"/>
@@ -1059,7 +1084,7 @@
         </w:tc>
         <w:tc>
           <w:tcPr>
-            <w:tcW w:w="1257" w:type="dxa"/>
+            <w:tcW w:w="578" w:type="dxa"/>
             <w:tcBorders>
               <w:start w:val="single" w:sz="4" w:space="0" w:color="000000"/>
               <w:bottom w:val="single" w:sz="4" w:space="0" w:color="000000"/>
@@ -1087,7 +1112,7 @@
         </w:tc>
         <w:tc>
           <w:tcPr>
-            <w:tcW w:w="578" w:type="dxa"/>
+            <w:tcW w:w="720" w:type="dxa"/>
             <w:tcBorders>
               <w:start w:val="single" w:sz="4" w:space="0" w:color="000000"/>
               <w:bottom w:val="single" w:sz="4" w:space="0" w:color="000000"/>
@@ -1115,7 +1140,7 @@
         </w:tc>
         <w:tc>
           <w:tcPr>
-            <w:tcW w:w="720" w:type="dxa"/>
+            <w:tcW w:w="721" w:type="dxa"/>
             <w:tcBorders>
               <w:start w:val="single" w:sz="4" w:space="0" w:color="000000"/>
               <w:bottom w:val="single" w:sz="4" w:space="0" w:color="000000"/>
@@ -1143,7 +1168,7 @@
         </w:tc>
         <w:tc>
           <w:tcPr>
-            <w:tcW w:w="721" w:type="dxa"/>
+            <w:tcW w:w="1438" w:type="dxa"/>
             <w:tcBorders>
               <w:start w:val="single" w:sz="4" w:space="0" w:color="000000"/>
               <w:bottom w:val="single" w:sz="4" w:space="0" w:color="000000"/>
@@ -1171,35 +1196,7 @@
         </w:tc>
         <w:tc>
           <w:tcPr>
-            <w:tcW w:w="1439" w:type="dxa"/>
-            <w:tcBorders>
-              <w:start w:val="single" w:sz="4" w:space="0" w:color="000000"/>
-              <w:bottom w:val="single" w:sz="4" w:space="0" w:color="000000"/>
-            </w:tcBorders>
-          </w:tcPr>
-          <w:p>
-            <w:pPr>
-              <w:pStyle w:val="TableContents"/>
-              <w:bidi w:val="0"/>
-              <w:jc w:val="start"/>
-              <w:rPr>
-                <w:rFonts w:ascii="Times New Roman" w:hAnsi="Times New Roman"/>
-                <w:sz w:val="20"/>
-                <w:szCs w:val="20"/>
-              </w:rPr>
-            </w:pPr>
-            <w:r>
-              <w:rPr>
-                <w:rFonts w:ascii="Times New Roman" w:hAnsi="Times New Roman"/>
-                <w:sz w:val="20"/>
-                <w:szCs w:val="20"/>
-              </w:rPr>
-            </w:r>
-          </w:p>
-        </w:tc>
-        <w:tc>
-          <w:tcPr>
-            <w:tcW w:w="3229" w:type="dxa"/>
+            <w:tcW w:w="3230" w:type="dxa"/>
             <w:tcBorders>
               <w:start w:val="single" w:sz="4" w:space="0" w:color="000000"/>
               <w:bottom w:val="single" w:sz="4" w:space="0" w:color="000000"/>
@@ -1354,7 +1351,9 @@
       </w:r>
     </w:p>
     <w:sectPr>
-      <w:headerReference w:type="default" r:id="rId2"/>
+      <w:headerReference w:type="even" r:id="rId2"/>
+      <w:headerReference w:type="default" r:id="rId3"/>
+      <w:headerReference w:type="first" r:id="rId4"/>
       <w:type w:val="nextPage"/>
       <w:pgSz w:orient="landscape" w:w="16838" w:h="11906"/>
       <w:pgMar w:left="1134" w:right="1134" w:gutter="0" w:header="562" w:top="3355" w:footer="0" w:bottom="1134"/>
@@ -1368,6 +1367,20 @@
 </file>
 
 <file path=word/header1.xml><?xml version="1.0" encoding="utf-8"?>
+<w:hdr xmlns:o="urn:schemas-microsoft-com:office:office" xmlns:r="http://schemas.openxmlformats.org/officeDocument/2006/relationships" xmlns:v="urn:schemas-microsoft-com:vml" xmlns:w="http://schemas.openxmlformats.org/wordprocessingml/2006/main" xmlns:w10="urn:schemas-microsoft-com:office:word" xmlns:wp="http://schemas.openxmlformats.org/drawingml/2006/wordprocessingDrawing" xmlns:pic="http://schemas.openxmlformats.org/drawingml/2006/picture" xmlns:wps="http://schemas.microsoft.com/office/word/2010/wordprocessingShape" xmlns:wpg="http://schemas.microsoft.com/office/word/2010/wordprocessingGroup" xmlns:mc="http://schemas.openxmlformats.org/markup-compatibility/2006" xmlns:wp14="http://schemas.microsoft.com/office/word/2010/wordprocessingDrawing" xmlns:w14="http://schemas.microsoft.com/office/word/2010/wordml" xmlns:w15="http://schemas.microsoft.com/office/word/2012/wordml" mc:Ignorable="w14 wp14 w15">
+  <w:p>
+    <w:pPr>
+      <w:pStyle w:val="Header"/>
+      <w:rPr/>
+    </w:pPr>
+    <w:r>
+      <w:rPr/>
+    </w:r>
+  </w:p>
+</w:hdr>
+</file>
+
+<file path=word/header2.xml><?xml version="1.0" encoding="utf-8"?>
 <w:hdr xmlns:o="urn:schemas-microsoft-com:office:office" xmlns:r="http://schemas.openxmlformats.org/officeDocument/2006/relationships" xmlns:v="urn:schemas-microsoft-com:vml" xmlns:w="http://schemas.openxmlformats.org/wordprocessingml/2006/main" xmlns:w10="urn:schemas-microsoft-com:office:word" xmlns:wp="http://schemas.openxmlformats.org/drawingml/2006/wordprocessingDrawing" xmlns:pic="http://schemas.openxmlformats.org/drawingml/2006/picture" xmlns:wps="http://schemas.microsoft.com/office/word/2010/wordprocessingShape" xmlns:wpg="http://schemas.microsoft.com/office/word/2010/wordprocessingGroup" xmlns:mc="http://schemas.openxmlformats.org/markup-compatibility/2006" xmlns:wp14="http://schemas.microsoft.com/office/word/2010/wordprocessingDrawing" xmlns:w14="http://schemas.microsoft.com/office/word/2010/wordml" xmlns:w15="http://schemas.microsoft.com/office/word/2012/wordml" mc:Ignorable="w14 wp14 w15">
   <w:p>
     <w:pPr>
@@ -1629,6 +1642,268 @@
 </w:hdr>
 </file>
 
+<file path=word/header3.xml><?xml version="1.0" encoding="utf-8"?>
+<w:hdr xmlns:o="urn:schemas-microsoft-com:office:office" xmlns:r="http://schemas.openxmlformats.org/officeDocument/2006/relationships" xmlns:v="urn:schemas-microsoft-com:vml" xmlns:w="http://schemas.openxmlformats.org/wordprocessingml/2006/main" xmlns:w10="urn:schemas-microsoft-com:office:word" xmlns:wp="http://schemas.openxmlformats.org/drawingml/2006/wordprocessingDrawing" xmlns:pic="http://schemas.openxmlformats.org/drawingml/2006/picture" xmlns:wps="http://schemas.microsoft.com/office/word/2010/wordprocessingShape" xmlns:wpg="http://schemas.microsoft.com/office/word/2010/wordprocessingGroup" xmlns:mc="http://schemas.openxmlformats.org/markup-compatibility/2006" xmlns:wp14="http://schemas.microsoft.com/office/word/2010/wordprocessingDrawing" xmlns:w14="http://schemas.microsoft.com/office/word/2010/wordml" xmlns:w15="http://schemas.microsoft.com/office/word/2012/wordml" mc:Ignorable="w14 wp14 w15">
+  <w:p>
+    <w:pPr>
+      <w:pStyle w:val="Normal"/>
+      <w:bidi w:val="0"/>
+      <w:spacing w:lineRule="auto" w:line="240" w:before="0" w:after="0"/>
+      <w:jc w:val="center"/>
+      <w:rPr>
+        <w:rFonts w:ascii="Times New Roman" w:hAnsi="Times New Roman"/>
+        <w:b/>
+        <w:bCs/>
+        <w:sz w:val="48"/>
+        <w:szCs w:val="48"/>
+      </w:rPr>
+    </w:pPr>
+    <w:bookmarkStart w:id="1" w:name="_GoBack"/>
+    <w:bookmarkEnd w:id="1"/>
+    <w:r>
+      <w:rPr>
+        <w:rFonts w:ascii="Times New Roman" w:hAnsi="Times New Roman"/>
+        <w:b/>
+        <w:bCs/>
+        <w:sz w:val="48"/>
+        <w:szCs w:val="48"/>
+        <w:lang w:val="es-AR"/>
+      </w:rPr>
+      <w:t>MINISTERIO DE EDUCACIÓN</w:t>
+    </w:r>
+  </w:p>
+  <w:p>
+    <w:pPr>
+      <w:pStyle w:val="Normal"/>
+      <w:bidi w:val="0"/>
+      <w:spacing w:lineRule="auto" w:line="240" w:before="0" w:after="0"/>
+      <w:jc w:val="center"/>
+      <w:rPr>
+        <w:rFonts w:ascii="Times New Roman" w:hAnsi="Times New Roman"/>
+        <w:b/>
+        <w:bCs/>
+        <w:sz w:val="32"/>
+        <w:szCs w:val="32"/>
+      </w:rPr>
+    </w:pPr>
+    <w:r>
+      <w:rPr>
+        <w:rFonts w:ascii="Times New Roman" w:hAnsi="Times New Roman"/>
+        <w:b/>
+        <w:bCs/>
+        <w:sz w:val="32"/>
+        <w:szCs w:val="32"/>
+        <w:lang w:val="es-AR"/>
+      </w:rPr>
+      <w:t>Secretaría Administrativa Financiera</w:t>
+    </w:r>
+  </w:p>
+  <w:p>
+    <w:pPr>
+      <w:pStyle w:val="Normal"/>
+      <w:bidi w:val="0"/>
+      <w:spacing w:lineRule="auto" w:line="240" w:before="0" w:after="0"/>
+      <w:jc w:val="center"/>
+      <w:rPr>
+        <w:rFonts w:ascii="Times New Roman" w:hAnsi="Times New Roman"/>
+        <w:lang w:val="es-AR"/>
+      </w:rPr>
+    </w:pPr>
+    <w:r>
+      <w:rPr>
+        <w:rFonts w:ascii="Times New Roman" w:hAnsi="Times New Roman"/>
+        <w:lang w:val="es-AR"/>
+      </w:rPr>
+    </w:r>
+  </w:p>
+  <w:p>
+    <w:pPr>
+      <w:pStyle w:val="Normal"/>
+      <w:bidi w:val="0"/>
+      <w:spacing w:lineRule="auto" w:line="240" w:before="0" w:after="0"/>
+      <w:jc w:val="center"/>
+      <w:rPr>
+        <w:rFonts w:ascii="Times New Roman" w:hAnsi="Times New Roman"/>
+        <w:sz w:val="32"/>
+        <w:szCs w:val="32"/>
+      </w:rPr>
+    </w:pPr>
+    <w:r>
+      <w:rPr>
+        <w:rFonts w:ascii="Times New Roman" w:hAnsi="Times New Roman"/>
+        <w:sz w:val="32"/>
+        <w:szCs w:val="32"/>
+        <w:lang w:val="es-AR"/>
+      </w:rPr>
+      <w:t>BAJA DE ACREDITACIONES BANCARIAS</w:t>
+    </w:r>
+  </w:p>
+  <w:tbl>
+    <w:tblPr>
+      <w:tblW w:w="5000" w:type="pct"/>
+      <w:jc w:val="start"/>
+      <w:tblInd w:w="-5" w:type="dxa"/>
+      <w:tblLayout w:type="fixed"/>
+      <w:tblCellMar>
+        <w:top w:w="55" w:type="dxa"/>
+        <w:start w:w="55" w:type="dxa"/>
+        <w:bottom w:w="55" w:type="dxa"/>
+        <w:end w:w="55" w:type="dxa"/>
+      </w:tblCellMar>
+    </w:tblPr>
+    <w:tblGrid>
+      <w:gridCol w:w="4856"/>
+      <w:gridCol w:w="4857"/>
+      <w:gridCol w:w="4857"/>
+    </w:tblGrid>
+    <w:tr>
+      <w:trPr>
+        <w:trHeight w:val="540" w:hRule="atLeast"/>
+      </w:trPr>
+      <w:tc>
+        <w:tcPr>
+          <w:tcW w:w="4856" w:type="dxa"/>
+          <w:tcBorders>
+            <w:top w:val="single" w:sz="4" w:space="0" w:color="000000"/>
+            <w:start w:val="single" w:sz="4" w:space="0" w:color="000000"/>
+            <w:bottom w:val="single" w:sz="4" w:space="0" w:color="000000"/>
+          </w:tcBorders>
+        </w:tcPr>
+        <w:p>
+          <w:pPr>
+            <w:pStyle w:val="Normal"/>
+            <w:bidi w:val="0"/>
+            <w:spacing w:lineRule="auto" w:line="240" w:before="0" w:after="0"/>
+            <w:jc w:val="start"/>
+            <w:rPr>
+              <w:sz w:val="20"/>
+              <w:szCs w:val="20"/>
+            </w:rPr>
+          </w:pPr>
+          <w:r>
+            <w:rPr>
+              <w:rFonts w:ascii="Times New Roman" w:hAnsi="Times New Roman"/>
+              <w:b/>
+              <w:bCs/>
+              <w:sz w:val="20"/>
+              <w:szCs w:val="20"/>
+              <w:lang w:val="es-AR"/>
+            </w:rPr>
+            <w:t>Concepto</w:t>
+          </w:r>
+          <w:r>
+            <w:rPr>
+              <w:rFonts w:ascii="Times New Roman" w:hAnsi="Times New Roman"/>
+              <w:sz w:val="20"/>
+              <w:szCs w:val="20"/>
+              <w:lang w:val="es-AR"/>
+            </w:rPr>
+            <w:t xml:space="preserve"> {{ concepto }}</w:t>
+          </w:r>
+        </w:p>
+      </w:tc>
+      <w:tc>
+        <w:tcPr>
+          <w:tcW w:w="4857" w:type="dxa"/>
+          <w:tcBorders>
+            <w:top w:val="single" w:sz="4" w:space="0" w:color="000000"/>
+            <w:bottom w:val="single" w:sz="4" w:space="0" w:color="000000"/>
+          </w:tcBorders>
+        </w:tcPr>
+        <w:p>
+          <w:pPr>
+            <w:pStyle w:val="Normal"/>
+            <w:bidi w:val="0"/>
+            <w:spacing w:lineRule="auto" w:line="240" w:before="0" w:after="0"/>
+            <w:jc w:val="start"/>
+            <w:rPr>
+              <w:sz w:val="20"/>
+              <w:szCs w:val="20"/>
+            </w:rPr>
+          </w:pPr>
+          <w:r>
+            <w:rPr>
+              <w:b/>
+              <w:bCs/>
+              <w:sz w:val="20"/>
+              <w:szCs w:val="20"/>
+              <w:lang w:val="es-AR"/>
+            </w:rPr>
+            <w:t>Disco</w:t>
+          </w:r>
+          <w:r>
+            <w:rPr>
+              <w:sz w:val="20"/>
+              <w:szCs w:val="20"/>
+              <w:lang w:val="es-AR"/>
+            </w:rPr>
+            <w:t xml:space="preserve"> {{ concepto }}</w:t>
+          </w:r>
+        </w:p>
+      </w:tc>
+      <w:tc>
+        <w:tcPr>
+          <w:tcW w:w="4857" w:type="dxa"/>
+          <w:tcBorders>
+            <w:top w:val="single" w:sz="4" w:space="0" w:color="000000"/>
+            <w:bottom w:val="single" w:sz="4" w:space="0" w:color="000000"/>
+            <w:end w:val="single" w:sz="4" w:space="0" w:color="000000"/>
+          </w:tcBorders>
+        </w:tcPr>
+        <w:p>
+          <w:pPr>
+            <w:pStyle w:val="Normal"/>
+            <w:bidi w:val="0"/>
+            <w:spacing w:lineRule="auto" w:line="240" w:before="0" w:after="0"/>
+            <w:jc w:val="start"/>
+            <w:rPr>
+              <w:sz w:val="20"/>
+              <w:szCs w:val="20"/>
+            </w:rPr>
+          </w:pPr>
+          <w:r>
+            <w:rPr>
+              <w:b/>
+              <w:bCs/>
+              <w:sz w:val="20"/>
+              <w:szCs w:val="20"/>
+              <w:lang w:val="es-AR"/>
+            </w:rPr>
+            <w:t>Fecha de Pago</w:t>
+          </w:r>
+          <w:r>
+            <w:rPr>
+              <w:sz w:val="20"/>
+              <w:szCs w:val="20"/>
+              <w:lang w:val="es-AR"/>
+            </w:rPr>
+            <w:t xml:space="preserve"> {{ fecha_pago }}</w:t>
+          </w:r>
+        </w:p>
+      </w:tc>
+    </w:tr>
+  </w:tbl>
+  <w:p>
+    <w:pPr>
+      <w:pStyle w:val="Normal"/>
+      <w:bidi w:val="0"/>
+      <w:spacing w:lineRule="auto" w:line="240" w:before="0" w:after="0"/>
+      <w:jc w:val="start"/>
+      <w:rPr>
+        <w:rFonts w:ascii="Times New Roman" w:hAnsi="Times New Roman"/>
+        <w:lang w:val="es-AR"/>
+      </w:rPr>
+    </w:pPr>
+    <w:r>
+      <w:rPr>
+        <w:rFonts w:ascii="Times New Roman" w:hAnsi="Times New Roman"/>
+        <w:lang w:val="es-AR"/>
+      </w:rPr>
+    </w:r>
+  </w:p>
+</w:hdr>
+</file>
+
 <file path=word/numbering.xml><?xml version="1.0" encoding="utf-8"?>
 <w:numbering xmlns:w="http://schemas.openxmlformats.org/wordprocessingml/2006/main" xmlns:o="urn:schemas-microsoft-com:office:office" xmlns:r="http://schemas.openxmlformats.org/officeDocument/2006/relationships" xmlns:v="urn:schemas-microsoft-com:vml" xmlns:mc="http://schemas.openxmlformats.org/markup-compatibility/2006" xmlns:w14="http://schemas.microsoft.com/office/word/2010/wordml" mc:Ignorable="w14">
   <w:abstractNum w:abstractNumId="1">

</xml_diff>